<commit_message>
SHAP and graphs done
</commit_message>
<xml_diff>
--- a/Documents/Research and intro to the project.docx
+++ b/Documents/Research and intro to the project.docx
@@ -875,23 +875,7 @@
           <w:b/>
           <w:bCs/>
         </w:rPr>
-        <w:t xml:space="preserve">7. </w:t>
-      </w:r>
-      <w:proofErr w:type="spellStart"/>
-      <w:r>
-        <w:rPr>
-          <w:b/>
-          <w:bCs/>
-        </w:rPr>
-        <w:t>PhishNet</w:t>
-      </w:r>
-      <w:proofErr w:type="spellEnd"/>
-      <w:r>
-        <w:rPr>
-          <w:b/>
-          <w:bCs/>
-        </w:rPr>
-        <w:t xml:space="preserve">-NLP: Detecting Phishing Emails the Natural Language </w:t>
+        <w:t xml:space="preserve">7. PhishNet-NLP: Detecting Phishing Emails the Natural Language </w:t>
       </w:r>
       <w:proofErr w:type="gramStart"/>
       <w:r>
@@ -3184,6 +3168,7 @@
   <w:style w:type="character" w:default="1" w:styleId="DefaultParagraphFont">
     <w:name w:val="Default Paragraph Font"/>
     <w:uiPriority w:val="1"/>
+    <w:semiHidden/>
     <w:unhideWhenUsed/>
   </w:style>
   <w:style w:type="table" w:default="1" w:styleId="TableNormal">

</xml_diff>